<commit_message>
Add CISO Tradecraft podcast to career development plan
Added CISO Tradecraft (youtube.com/@cisotradecraft) as priority 3 in
the Podcasts section of both the .md and .docx templates. Renumbered
Risky Business, CISO Series, and Security Now to 4-6.

Closes #70

Co-Authored-By: Claude Sonnet 4.6 <noreply@anthropic.com>
</commit_message>
<xml_diff>
--- a/GRC_CDP_Template.docx
+++ b/GRC_CDP_Template.docx
@@ -11773,6 +11773,61 @@
               <w:cnfStyle w:val="000000100000" w:firstRow="0" w:lastRow="0" w:firstColumn="0" w:lastColumn="0" w:oddVBand="0" w:evenVBand="0" w:oddHBand="1" w:evenHBand="0" w:firstRowFirstColumn="0" w:firstRowLastColumn="0" w:lastRowFirstColumn="0" w:lastRowLastColumn="0"/>
             </w:pPr>
             <w:r>
+              <w:t>CISO Tradecraft</w:t>
+            </w:r>
+          </w:p>
+        </w:tc>
+        <w:tc>
+          <w:tcPr>
+            <w:cnfStyle w:val="000010000000" w:firstRow="0" w:lastRow="0" w:firstColumn="0" w:lastColumn="0" w:oddVBand="1" w:evenVBand="0" w:oddHBand="0" w:evenHBand="0" w:firstRowFirstColumn="0" w:firstRowLastColumn="0" w:lastRowFirstColumn="0" w:lastRowLastColumn="0"/>
+            <w:tcW w:w="5669" w:type="dxa"/>
+          </w:tcPr>
+          <w:p>
+            <w:pPr>
+              <w:pStyle w:val="Compact"/>
+            </w:pPr>
+            <w:r>
+              <w:t>Practical CISO-level guidance on security strategy, risk, and leadership. One of the foundational resources for understanding how CISOs think. youtube.com/@cisotradecraft</w:t>
+            </w:r>
+            <w:hyperlink r:id="rId49">
+              <w:r>
+                <w:rPr>
+                  <w:rStyle w:val="Hyperlink"/>
+                </w:rPr>
+                <w:t>darknetdiaries.com</w:t>
+              </w:r>
+            </w:hyperlink>
+          </w:p>
+        </w:tc>
+      </w:tr>
+      <w:tr>
+        <w:trPr>
+          <w:cnfStyle w:val="000000100000" w:firstRow="0" w:lastRow="0" w:firstColumn="0" w:lastColumn="0" w:oddVBand="0" w:evenVBand="0" w:oddHBand="1" w:evenHBand="0" w:firstRowFirstColumn="0" w:firstRowLastColumn="0" w:lastRowFirstColumn="0" w:lastRowLastColumn="0"/>
+        </w:trPr>
+        <w:tc>
+          <w:tcPr>
+            <w:cnfStyle w:val="000010000000" w:firstRow="0" w:lastRow="0" w:firstColumn="0" w:lastColumn="0" w:oddVBand="1" w:evenVBand="0" w:oddHBand="0" w:evenHBand="0" w:firstRowFirstColumn="0" w:firstRowLastColumn="0" w:lastRowFirstColumn="0" w:lastRowLastColumn="0"/>
+            <w:tcW w:w="1413" w:type="dxa"/>
+          </w:tcPr>
+          <w:p>
+            <w:pPr>
+              <w:pStyle w:val="Compact"/>
+            </w:pPr>
+            <w:r>
+              <w:t>4</w:t>
+            </w:r>
+          </w:p>
+        </w:tc>
+        <w:tc>
+          <w:tcPr>
+            <w:tcW w:w="2268" w:type="dxa"/>
+          </w:tcPr>
+          <w:p>
+            <w:pPr>
+              <w:pStyle w:val="Compact"/>
+              <w:cnfStyle w:val="000000100000" w:firstRow="0" w:lastRow="0" w:firstColumn="0" w:lastColumn="0" w:oddVBand="0" w:evenVBand="0" w:oddHBand="1" w:evenHBand="0" w:firstRowFirstColumn="0" w:firstRowLastColumn="0" w:lastRowFirstColumn="0" w:lastRowLastColumn="0"/>
+            </w:pPr>
+            <w:r>
               <w:t>Risky Business</w:t>
             </w:r>
           </w:p>
@@ -11811,7 +11866,7 @@
               <w:pStyle w:val="Compact"/>
             </w:pPr>
             <w:r>
-              <w:t>4</w:t>
+              <w:t>5</w:t>
             </w:r>
           </w:p>
         </w:tc>
@@ -11866,7 +11921,7 @@
               <w:pStyle w:val="Compact"/>
             </w:pPr>
             <w:r>
-              <w:t>5</w:t>
+              <w:t>6</w:t>
             </w:r>
           </w:p>
         </w:tc>

</xml_diff>